<commit_message>
improvement in the retriever thresholding and system prompt
</commit_message>
<xml_diff>
--- a/RagBot/new-KB/DA-Help.docx
+++ b/RagBot/new-KB/DA-Help.docx
@@ -59,29 +59,7 @@
           <w:rtl/>
           <w:lang w:bidi="fa-IR"/>
         </w:rPr>
-        <w:t xml:space="preserve"> همکاران سیستم، نقطه عطف مهمی در مسیر نوآوری و توسعه </w:t>
-      </w:r>
-      <w:proofErr w:type="spellStart"/>
-      <w:r>
-        <w:rPr>
-          <w:rFonts w:ascii="SG Kara" w:hAnsi="SG Kara" w:cs="SG Kara"/>
-          <w:sz w:val="20"/>
-          <w:szCs w:val="20"/>
-          <w:rtl/>
-          <w:lang w:bidi="fa-IR"/>
-        </w:rPr>
-        <w:t>کاربرمحور</w:t>
-      </w:r>
-      <w:proofErr w:type="spellEnd"/>
-      <w:r>
-        <w:rPr>
-          <w:rFonts w:ascii="SG Kara" w:hAnsi="SG Kara" w:cs="SG Kara"/>
-          <w:sz w:val="20"/>
-          <w:szCs w:val="20"/>
-          <w:rtl/>
-          <w:lang w:bidi="fa-IR"/>
-        </w:rPr>
-        <w:t xml:space="preserve"> سیستم های یکپارچه سازمانی است. سفر تحول دیجیتال، با سیستم های مبتنی بر </w:t>
+        <w:t xml:space="preserve"> همکاران سیستم، نقطه عطف مهمی در مسیر نوآوری و توسعه کاربرمحور سیستم های یکپارچه سازمانی است. سفر تحول دیجیتال، با سیستم های مبتنی بر </w:t>
       </w:r>
       <w:r>
         <w:rPr>
@@ -100,29 +78,7 @@
           <w:rtl/>
           <w:lang w:bidi="fa-IR"/>
         </w:rPr>
-        <w:t xml:space="preserve"> در سال 1366 آغاز شد که زمینه را برای یکپارچه سازی </w:t>
-      </w:r>
-      <w:proofErr w:type="spellStart"/>
-      <w:r>
-        <w:rPr>
-          <w:rFonts w:ascii="SG Kara" w:hAnsi="SG Kara" w:cs="SG Kara"/>
-          <w:sz w:val="20"/>
-          <w:szCs w:val="20"/>
-          <w:rtl/>
-          <w:lang w:bidi="fa-IR"/>
-        </w:rPr>
-        <w:t>فرایندهای</w:t>
-      </w:r>
-      <w:proofErr w:type="spellEnd"/>
-      <w:r>
-        <w:rPr>
-          <w:rFonts w:ascii="SG Kara" w:hAnsi="SG Kara" w:cs="SG Kara"/>
-          <w:sz w:val="20"/>
-          <w:szCs w:val="20"/>
-          <w:rtl/>
-          <w:lang w:bidi="fa-IR"/>
-        </w:rPr>
-        <w:t xml:space="preserve"> مختلف کسب و کار فراهم کرد. در نسل دوم، انتقال به سیستم های مبتنی بر </w:t>
+        <w:t xml:space="preserve"> در سال 1366 آغاز شد که زمینه را برای یکپارچه سازی فرایندهای مختلف کسب و کار فراهم کرد. در نسل دوم، انتقال به سیستم های مبتنی بر </w:t>
       </w:r>
       <w:r>
         <w:rPr>
@@ -141,95 +97,7 @@
           <w:rtl/>
           <w:lang w:bidi="fa-IR"/>
         </w:rPr>
-        <w:t xml:space="preserve"> قابلیت های توسعه نرم افزاری را به طور قابل توجهی افزایش داد. در این مرحله توسعه </w:t>
-      </w:r>
-      <w:proofErr w:type="spellStart"/>
-      <w:r>
-        <w:rPr>
-          <w:rFonts w:ascii="SG Kara" w:hAnsi="SG Kara" w:cs="SG Kara"/>
-          <w:sz w:val="20"/>
-          <w:szCs w:val="20"/>
-          <w:rtl/>
-          <w:lang w:bidi="fa-IR"/>
-        </w:rPr>
-        <w:t>فرایندهای</w:t>
-      </w:r>
-      <w:proofErr w:type="spellEnd"/>
-      <w:r>
-        <w:rPr>
-          <w:rFonts w:ascii="SG Kara" w:hAnsi="SG Kara" w:cs="SG Kara"/>
-          <w:sz w:val="20"/>
-          <w:szCs w:val="20"/>
-          <w:rtl/>
-          <w:lang w:bidi="fa-IR"/>
-        </w:rPr>
-        <w:t xml:space="preserve"> پیچیده تری از طریق </w:t>
-      </w:r>
-      <w:proofErr w:type="spellStart"/>
-      <w:r>
-        <w:rPr>
-          <w:rFonts w:ascii="SG Kara" w:hAnsi="SG Kara" w:cs="SG Kara"/>
-          <w:sz w:val="20"/>
-          <w:szCs w:val="20"/>
-          <w:rtl/>
-          <w:lang w:bidi="fa-IR"/>
-        </w:rPr>
-        <w:t>قابلیت‌های</w:t>
-      </w:r>
-      <w:proofErr w:type="spellEnd"/>
-      <w:r>
-        <w:rPr>
-          <w:rFonts w:ascii="SG Kara" w:hAnsi="SG Kara" w:cs="SG Kara"/>
-          <w:sz w:val="20"/>
-          <w:szCs w:val="20"/>
-          <w:rtl/>
-          <w:lang w:bidi="fa-IR"/>
-        </w:rPr>
-        <w:t xml:space="preserve"> ارائه شده، میسر شده و امکان مدیریت بهتر جریان داده ها فراهم گردید. با پیشرفت تکنولوژی و روی کار آمدن اینترنت، نیاز به سیستم های مبتنی بر </w:t>
-      </w:r>
-      <w:proofErr w:type="spellStart"/>
-      <w:r>
-        <w:rPr>
-          <w:rFonts w:ascii="SG Kara" w:hAnsi="SG Kara" w:cs="SG Kara"/>
-          <w:sz w:val="20"/>
-          <w:szCs w:val="20"/>
-          <w:rtl/>
-          <w:lang w:bidi="fa-IR"/>
-        </w:rPr>
-        <w:t>وب</w:t>
-      </w:r>
-      <w:proofErr w:type="spellEnd"/>
-      <w:r>
-        <w:rPr>
-          <w:rFonts w:ascii="SG Kara" w:hAnsi="SG Kara" w:cs="SG Kara"/>
-          <w:sz w:val="20"/>
-          <w:szCs w:val="20"/>
-          <w:rtl/>
-          <w:lang w:bidi="fa-IR"/>
-        </w:rPr>
-        <w:t xml:space="preserve"> که به طور یکپارچه در دسترس کاربران باشند، موجب توسعه نسل بعدی سیستم های یکپارچه در همکاران سیستم گردید. نسل سوم </w:t>
-      </w:r>
-      <w:proofErr w:type="spellStart"/>
-      <w:r>
-        <w:rPr>
-          <w:rFonts w:ascii="SG Kara" w:hAnsi="SG Kara" w:cs="SG Kara"/>
-          <w:sz w:val="20"/>
-          <w:szCs w:val="20"/>
-          <w:rtl/>
-          <w:lang w:bidi="fa-IR"/>
-        </w:rPr>
-        <w:t>جهشی</w:t>
-      </w:r>
-      <w:proofErr w:type="spellEnd"/>
-      <w:r>
-        <w:rPr>
-          <w:rFonts w:ascii="SG Kara" w:hAnsi="SG Kara" w:cs="SG Kara"/>
-          <w:sz w:val="20"/>
-          <w:szCs w:val="20"/>
-          <w:rtl/>
-          <w:lang w:bidi="fa-IR"/>
-        </w:rPr>
-        <w:t xml:space="preserve"> رو به جلو و گامی حیاتی در جهت مدرن کردن رویکرد همکاران سیستم و پاسخگویی به نیازهای در حال رشد کسب و کارها، در دنیای دیجیتال بود.   </w:t>
+        <w:t xml:space="preserve"> قابلیت های توسعه نرم افزاری را به طور قابل توجهی افزایش داد. در این مرحله توسعه فرایندهای پیچیده تری از طریق قابلیت‌های ارائه شده، میسر شده و امکان مدیریت بهتر جریان داده ها فراهم گردید. با پیشرفت تکنولوژی و روی کار آمدن اینترنت، نیاز به سیستم های مبتنی بر وب که به طور یکپارچه در دسترس کاربران باشند، موجب توسعه نسل بعدی سیستم های یکپارچه در همکاران سیستم گردید. نسل سوم جهشی رو به جلو و گامی حیاتی در جهت مدرن کردن رویکرد همکاران سیستم و پاسخگویی به نیازهای در حال رشد کسب و کارها، در دنیای دیجیتال بود.   </w:t>
       </w:r>
     </w:p>
     <w:p>
@@ -272,73 +140,7 @@
           <w:rtl/>
           <w:lang w:bidi="fa-IR"/>
         </w:rPr>
-        <w:t xml:space="preserve"> ما به </w:t>
-      </w:r>
-      <w:proofErr w:type="spellStart"/>
-      <w:r>
-        <w:rPr>
-          <w:rFonts w:ascii="SG Kara" w:hAnsi="SG Kara" w:cs="SG Kara"/>
-          <w:sz w:val="20"/>
-          <w:szCs w:val="20"/>
-          <w:rtl/>
-          <w:lang w:bidi="fa-IR"/>
-        </w:rPr>
-        <w:t>پلتفرمی</w:t>
-      </w:r>
-      <w:proofErr w:type="spellEnd"/>
-      <w:r>
-        <w:rPr>
-          <w:rFonts w:ascii="SG Kara" w:hAnsi="SG Kara" w:cs="SG Kara"/>
-          <w:sz w:val="20"/>
-          <w:szCs w:val="20"/>
-          <w:rtl/>
-          <w:lang w:bidi="fa-IR"/>
-        </w:rPr>
-        <w:t xml:space="preserve"> </w:t>
-      </w:r>
-      <w:proofErr w:type="spellStart"/>
-      <w:r>
-        <w:rPr>
-          <w:rFonts w:ascii="SG Kara" w:hAnsi="SG Kara" w:cs="SG Kara"/>
-          <w:sz w:val="20"/>
-          <w:szCs w:val="20"/>
-          <w:rtl/>
-          <w:lang w:bidi="fa-IR"/>
-        </w:rPr>
-        <w:t>هوشمندتر</w:t>
-      </w:r>
-      <w:proofErr w:type="spellEnd"/>
-      <w:r>
-        <w:rPr>
-          <w:rFonts w:ascii="SG Kara" w:hAnsi="SG Kara" w:cs="SG Kara"/>
-          <w:sz w:val="20"/>
-          <w:szCs w:val="20"/>
-          <w:rtl/>
-          <w:lang w:bidi="fa-IR"/>
-        </w:rPr>
-        <w:t xml:space="preserve">، صنعت محور و با طراحی کاربری پیشرفته تبدیل شده است. این نسل با بهره گیری از هوش مصنوعی، به سازمان ها این امکان را میدهد که تصمیمات هوشمندانه تری بگیرند و </w:t>
-      </w:r>
-      <w:proofErr w:type="spellStart"/>
-      <w:r>
-        <w:rPr>
-          <w:rFonts w:ascii="SG Kara" w:hAnsi="SG Kara" w:cs="SG Kara"/>
-          <w:sz w:val="20"/>
-          <w:szCs w:val="20"/>
-          <w:rtl/>
-          <w:lang w:bidi="fa-IR"/>
-        </w:rPr>
-        <w:t>فرایندهای</w:t>
-      </w:r>
-      <w:proofErr w:type="spellEnd"/>
-      <w:r>
-        <w:rPr>
-          <w:rFonts w:ascii="SG Kara" w:hAnsi="SG Kara" w:cs="SG Kara"/>
-          <w:sz w:val="20"/>
-          <w:szCs w:val="20"/>
-          <w:rtl/>
-          <w:lang w:bidi="fa-IR"/>
-        </w:rPr>
-        <w:t xml:space="preserve"> پیچیده را به طور خودکار و بهینه مدیریت کنند. علاوه بر این، با تمرکز بر تجربه کاربری </w:t>
+        <w:t xml:space="preserve"> ما به پلتفرمی هوشمندتر، صنعت محور و با طراحی کاربری پیشرفته تبدیل شده است. این نسل با بهره گیری از هوش مصنوعی، به سازمان ها این امکان را میدهد که تصمیمات هوشمندانه تری بگیرند و فرایندهای پیچیده را به طور خودکار و بهینه مدیریت کنند. علاوه بر این، با تمرکز بر تجربه کاربری </w:t>
       </w:r>
       <w:r>
         <w:rPr>
@@ -382,29 +184,7 @@
           <w:rtl/>
           <w:lang w:bidi="fa-IR"/>
         </w:rPr>
-        <w:t xml:space="preserve">سیستم یکپارچه نسل 4 همکاران سیستم، </w:t>
-      </w:r>
-      <w:proofErr w:type="spellStart"/>
-      <w:r>
-        <w:rPr>
-          <w:rFonts w:ascii="SG Kara" w:hAnsi="SG Kara" w:cs="SG Kara"/>
-          <w:sz w:val="20"/>
-          <w:szCs w:val="20"/>
-          <w:rtl/>
-          <w:lang w:bidi="fa-IR"/>
-        </w:rPr>
-        <w:t>راهکاری</w:t>
-      </w:r>
-      <w:proofErr w:type="spellEnd"/>
-      <w:r>
-        <w:rPr>
-          <w:rFonts w:ascii="SG Kara" w:hAnsi="SG Kara" w:cs="SG Kara"/>
-          <w:sz w:val="20"/>
-          <w:szCs w:val="20"/>
-          <w:rtl/>
-          <w:lang w:bidi="fa-IR"/>
-        </w:rPr>
-        <w:t xml:space="preserve"> ابری است که در مقایسه با سایر راهکارها برای کاربران و مشتریان، مزایای بیشماری دارد که از جمله مهمترین آنها میتوان به مقرون به صرفه بودن، سرعت پیاده سازی بالا، سادگی نگهداری و پشتیبانی، و دسترسی و مقیاس پذیری بالای آن اشاره کرد. این عوامل این سیستم را برای انواع کسب و کارها در اندازه های مختلف که به دنبال افزایش کارایی عملیاتی خود بدون متحمل شدن هزینه های سنگین اولیه یا مشکلات مداوم ناشی از فناوری اطلاعات هستند، جذاب میکند.  </w:t>
+        <w:t xml:space="preserve">سیستم یکپارچه نسل 4 همکاران سیستم، راهکاری ابری است که در مقایسه با سایر راهکارها برای کاربران و مشتریان، مزایای بیشماری دارد که از جمله مهمترین آنها میتوان به مقرون به صرفه بودن، سرعت پیاده سازی بالا، سادگی نگهداری و پشتیبانی، و دسترسی و مقیاس پذیری بالای آن اشاره کرد. این عوامل این سیستم را برای انواع کسب و کارها در اندازه های مختلف که به دنبال افزایش کارایی عملیاتی خود بدون متحمل شدن هزینه های سنگین اولیه یا مشکلات مداوم ناشی از فناوری اطلاعات هستند، جذاب میکند.  </w:t>
       </w:r>
     </w:p>
     <w:p>
@@ -428,29 +208,7 @@
           <w:rtl/>
           <w:lang w:bidi="fa-IR"/>
         </w:rPr>
-        <w:t xml:space="preserve">به علاوه در این سیستم یکپارچه، تلاش شده تا با ساده سازی و اتوماتیک سازی هر چه بیشتر </w:t>
-      </w:r>
-      <w:proofErr w:type="spellStart"/>
-      <w:r>
-        <w:rPr>
-          <w:rFonts w:ascii="SG Kara" w:hAnsi="SG Kara" w:cs="SG Kara"/>
-          <w:sz w:val="20"/>
-          <w:szCs w:val="20"/>
-          <w:rtl/>
-          <w:lang w:bidi="fa-IR"/>
-        </w:rPr>
-        <w:t>فرایندهای</w:t>
-      </w:r>
-      <w:proofErr w:type="spellEnd"/>
-      <w:r>
-        <w:rPr>
-          <w:rFonts w:ascii="SG Kara" w:hAnsi="SG Kara" w:cs="SG Kara"/>
-          <w:sz w:val="20"/>
-          <w:szCs w:val="20"/>
-          <w:rtl/>
-          <w:lang w:bidi="fa-IR"/>
-        </w:rPr>
-        <w:t xml:space="preserve"> کسب و کار، و ارائه یک رابط کاربری ساده، امکان دسترسی به اطلاعات را با جستجوی پیشرفته در یک محیط یکپارچه فراهم میکند. </w:t>
+        <w:t xml:space="preserve">به علاوه در این سیستم یکپارچه، تلاش شده تا با ساده سازی و اتوماتیک سازی هر چه بیشتر فرایندهای کسب و کار، و ارائه یک رابط کاربری ساده، امکان دسترسی به اطلاعات را با جستجوی پیشرفته در یک محیط یکپارچه فراهم میکند. </w:t>
       </w:r>
     </w:p>
     <w:p>
@@ -474,29 +232,7 @@
           <w:rtl/>
           <w:lang w:bidi="fa-IR"/>
         </w:rPr>
-        <w:t xml:space="preserve">این </w:t>
-      </w:r>
-      <w:proofErr w:type="spellStart"/>
-      <w:r>
-        <w:rPr>
-          <w:rFonts w:ascii="SG Kara" w:hAnsi="SG Kara" w:cs="SG Kara"/>
-          <w:sz w:val="20"/>
-          <w:szCs w:val="20"/>
-          <w:rtl/>
-          <w:lang w:bidi="fa-IR"/>
-        </w:rPr>
-        <w:t>راهکار</w:t>
-      </w:r>
-      <w:proofErr w:type="spellEnd"/>
-      <w:r>
-        <w:rPr>
-          <w:rFonts w:ascii="SG Kara" w:hAnsi="SG Kara" w:cs="SG Kara"/>
-          <w:sz w:val="20"/>
-          <w:szCs w:val="20"/>
-          <w:rtl/>
-          <w:lang w:bidi="fa-IR"/>
-        </w:rPr>
-        <w:t xml:space="preserve"> به شکلی طراحی شده است که در کنار پاسخ گویی به نیازهای اساسی و محوری کسب و کار، از طریق قابلیت های سفارشی سازی، امکان تغییر و متناسب سازی سیستم مطابق با نیازهای کسب و کار و سازمان را در اختیار مشتریان قرار میدهد. با سهولت عملیات و دسترسی به گزارش ها و داده های تحلیلی، تصویر کاملی از عملیات کسب و کار ارائه میشود که مشتریان را قادر میسازد بر روی موارد مهم کسب و کار متمرکز شده و ریسک های پیش رو را به دقت شناسایی و ارزیابی کرده و تصمیمات دقیق تر و سریع تری بگیرند. </w:t>
+        <w:t xml:space="preserve">این راهکار به شکلی طراحی شده است که در کنار پاسخ گویی به نیازهای اساسی و محوری کسب و کار، از طریق قابلیت های سفارشی سازی، امکان تغییر و متناسب سازی سیستم مطابق با نیازهای کسب و کار و سازمان را در اختیار مشتریان قرار میدهد. با سهولت عملیات و دسترسی به گزارش ها و داده های تحلیلی، تصویر کاملی از عملیات کسب و کار ارائه میشود که مشتریان را قادر میسازد بر روی موارد مهم کسب و کار متمرکز شده و ریسک های پیش رو را به دقت شناسایی و ارزیابی کرده و تصمیمات دقیق تر و سریع تری بگیرند. </w:t>
       </w:r>
     </w:p>
     <w:p>
@@ -541,7 +277,15 @@
           <w:rtl/>
           <w:lang w:bidi="fa-IR"/>
         </w:rPr>
-        <w:t>راهنمای استفاده از دستیار دیجیتال</w:t>
+        <w:t xml:space="preserve">معرفی </w:t>
+      </w:r>
+      <w:r>
+        <w:rPr>
+          <w:rFonts w:hint="cs"/>
+          <w:rtl/>
+          <w:lang w:bidi="fa-IR"/>
+        </w:rPr>
+        <w:t>دستیار دیجیتال</w:t>
       </w:r>
     </w:p>
     <w:p>
@@ -644,31 +388,8 @@
           <w:rtl/>
           <w:lang w:bidi="fa-IR"/>
         </w:rPr>
-        <w:t xml:space="preserve">در حال حاضر این چت </w:t>
-      </w:r>
-      <w:proofErr w:type="spellStart"/>
-      <w:r>
-        <w:rPr>
-          <w:rFonts w:ascii="SG Kara" w:hAnsi="SG Kara" w:cs="SG Kara" w:hint="cs"/>
-          <w:sz w:val="20"/>
-          <w:szCs w:val="20"/>
-          <w:rtl/>
-          <w:lang w:bidi="fa-IR"/>
-        </w:rPr>
-        <w:t>بات</w:t>
-      </w:r>
-      <w:proofErr w:type="spellEnd"/>
-      <w:r>
-        <w:rPr>
-          <w:rFonts w:ascii="SG Kara" w:hAnsi="SG Kara" w:cs="SG Kara" w:hint="cs"/>
-          <w:sz w:val="20"/>
-          <w:szCs w:val="20"/>
-          <w:rtl/>
-          <w:lang w:bidi="fa-IR"/>
-        </w:rPr>
-        <w:t xml:space="preserve"> قادر است </w:t>
-      </w:r>
-      <w:proofErr w:type="spellStart"/>
+        <w:t xml:space="preserve">در حال حاضر این چت بات قادر است </w:t>
+      </w:r>
       <w:r>
         <w:rPr>
           <w:rFonts w:ascii="SG Kara" w:hAnsi="SG Kara" w:cs="SG Kara" w:hint="cs"/>
@@ -679,7 +400,6 @@
         </w:rPr>
         <w:t>پرسش‌های</w:t>
       </w:r>
-      <w:proofErr w:type="spellEnd"/>
       <w:r>
         <w:rPr>
           <w:rFonts w:ascii="SG Kara" w:hAnsi="SG Kara" w:cs="SG Kara" w:hint="cs"/>
@@ -761,29 +481,7 @@
           <w:rtl/>
           <w:lang w:bidi="fa-IR"/>
         </w:rPr>
-        <w:t xml:space="preserve">دسترسی به این چت </w:t>
-      </w:r>
-      <w:proofErr w:type="spellStart"/>
-      <w:r>
-        <w:rPr>
-          <w:rFonts w:ascii="SG Kara" w:hAnsi="SG Kara" w:cs="SG Kara" w:hint="cs"/>
-          <w:sz w:val="20"/>
-          <w:szCs w:val="20"/>
-          <w:rtl/>
-          <w:lang w:bidi="fa-IR"/>
-        </w:rPr>
-        <w:t>بات</w:t>
-      </w:r>
-      <w:proofErr w:type="spellEnd"/>
-      <w:r>
-        <w:rPr>
-          <w:rFonts w:ascii="SG Kara" w:hAnsi="SG Kara" w:cs="SG Kara" w:hint="cs"/>
-          <w:sz w:val="20"/>
-          <w:szCs w:val="20"/>
-          <w:rtl/>
-          <w:lang w:bidi="fa-IR"/>
-        </w:rPr>
-        <w:t>، در هر زمان تنها با یک کلیک</w:t>
+        <w:t>دسترسی به این چت بات، در هر زمان تنها با یک کلیک</w:t>
       </w:r>
       <w:r>
         <w:rPr>
@@ -873,29 +571,7 @@
           <w:rtl/>
           <w:lang w:bidi="fa-IR"/>
         </w:rPr>
-        <w:t xml:space="preserve"> کار با سیستم، روش ورود اطلاعات در فرم‌ها و هر گونه دریافت راهنمایی دیگری در مورد ماژول دفتر کل و انبار به این چت </w:t>
-      </w:r>
-      <w:proofErr w:type="spellStart"/>
-      <w:r>
-        <w:rPr>
-          <w:rFonts w:ascii="SG Kara" w:hAnsi="SG Kara" w:cs="SG Kara" w:hint="cs"/>
-          <w:sz w:val="20"/>
-          <w:szCs w:val="20"/>
-          <w:rtl/>
-          <w:lang w:bidi="fa-IR"/>
-        </w:rPr>
-        <w:t>بات</w:t>
-      </w:r>
-      <w:proofErr w:type="spellEnd"/>
-      <w:r>
-        <w:rPr>
-          <w:rFonts w:ascii="SG Kara" w:hAnsi="SG Kara" w:cs="SG Kara" w:hint="cs"/>
-          <w:sz w:val="20"/>
-          <w:szCs w:val="20"/>
-          <w:rtl/>
-          <w:lang w:bidi="fa-IR"/>
-        </w:rPr>
-        <w:t xml:space="preserve"> مراجعه کنند. </w:t>
+        <w:t xml:space="preserve"> کار با سیستم، روش ورود اطلاعات در فرم‌ها و هر گونه دریافت راهنمایی دیگری در مورد ماژول دفتر کل و انبار به این چت بات مراجعه کنند. </w:t>
       </w:r>
     </w:p>
     <w:p>
@@ -928,25 +604,7 @@
           <w:rtl/>
           <w:lang w:bidi="fa-IR"/>
         </w:rPr>
-        <w:t xml:space="preserve">امکانات چت </w:t>
-      </w:r>
-      <w:proofErr w:type="spellStart"/>
-      <w:r>
-        <w:rPr>
-          <w:rFonts w:hint="cs"/>
-          <w:rtl/>
-          <w:lang w:bidi="fa-IR"/>
-        </w:rPr>
-        <w:t>بات</w:t>
-      </w:r>
-      <w:proofErr w:type="spellEnd"/>
-      <w:r>
-        <w:rPr>
-          <w:rFonts w:hint="cs"/>
-          <w:rtl/>
-          <w:lang w:bidi="fa-IR"/>
-        </w:rPr>
-        <w:t xml:space="preserve"> دستیار دیجیتال</w:t>
+        <w:t>امکانات چت بات دستیار دیجیتال</w:t>
       </w:r>
     </w:p>
     <w:p>
@@ -1047,20 +705,8 @@
           <w:lang w:bidi="fa-IR"/>
         </w:rPr>
         <w:lastRenderedPageBreak/>
-        <w:t xml:space="preserve">دسترسی به چت </w:t>
-      </w:r>
-      <w:proofErr w:type="spellStart"/>
-      <w:r>
-        <w:rPr>
-          <w:rFonts w:ascii="SG Kara" w:hAnsi="SG Kara" w:cs="SG Kara" w:hint="cs"/>
-          <w:sz w:val="20"/>
-          <w:szCs w:val="20"/>
-          <w:rtl/>
-          <w:lang w:bidi="fa-IR"/>
-        </w:rPr>
-        <w:t>بات</w:t>
-      </w:r>
-      <w:proofErr w:type="spellEnd"/>
+        <w:t>دسترسی به چت بات</w:t>
+      </w:r>
       <w:r>
         <w:rPr>
           <w:rFonts w:ascii="SG Kara" w:hAnsi="SG Kara" w:cs="SG Kara" w:hint="cs"/>
@@ -1098,29 +744,7 @@
           <w:rtl/>
           <w:lang w:bidi="fa-IR"/>
         </w:rPr>
-        <w:t xml:space="preserve"> بر روی آن دیده میشود. در صورت فشردن این دکمه، چت </w:t>
-      </w:r>
-      <w:proofErr w:type="spellStart"/>
-      <w:r>
-        <w:rPr>
-          <w:rFonts w:ascii="SG Kara" w:hAnsi="SG Kara" w:cs="SG Kara" w:hint="cs"/>
-          <w:sz w:val="20"/>
-          <w:szCs w:val="20"/>
-          <w:rtl/>
-          <w:lang w:bidi="fa-IR"/>
-        </w:rPr>
-        <w:t>بات</w:t>
-      </w:r>
-      <w:proofErr w:type="spellEnd"/>
-      <w:r>
-        <w:rPr>
-          <w:rFonts w:ascii="SG Kara" w:hAnsi="SG Kara" w:cs="SG Kara" w:hint="cs"/>
-          <w:sz w:val="20"/>
-          <w:szCs w:val="20"/>
-          <w:rtl/>
-          <w:lang w:bidi="fa-IR"/>
-        </w:rPr>
-        <w:t xml:space="preserve"> دستیار دیجیتال باز شده و آماده شروع گفتگو با شما میشود. </w:t>
+        <w:t xml:space="preserve"> بر روی آن دیده میشود. در صورت فشردن این دکمه، چت بات دستیار دیجیتال باز شده و آماده شروع گفتگو با شما میشود. </w:t>
       </w:r>
     </w:p>
     <w:p>
@@ -1254,29 +878,7 @@
           <w:rtl/>
           <w:lang w:bidi="fa-IR"/>
         </w:rPr>
-        <w:t xml:space="preserve">پایین چت </w:t>
-      </w:r>
-      <w:proofErr w:type="spellStart"/>
-      <w:r>
-        <w:rPr>
-          <w:rFonts w:ascii="SG Kara" w:hAnsi="SG Kara" w:cs="SG Kara" w:hint="cs"/>
-          <w:sz w:val="20"/>
-          <w:szCs w:val="20"/>
-          <w:rtl/>
-          <w:lang w:bidi="fa-IR"/>
-        </w:rPr>
-        <w:t>بات</w:t>
-      </w:r>
-      <w:proofErr w:type="spellEnd"/>
-      <w:r>
-        <w:rPr>
-          <w:rFonts w:ascii="SG Kara" w:hAnsi="SG Kara" w:cs="SG Kara" w:hint="cs"/>
-          <w:sz w:val="20"/>
-          <w:szCs w:val="20"/>
-          <w:rtl/>
-          <w:lang w:bidi="fa-IR"/>
-        </w:rPr>
-        <w:t xml:space="preserve">، محلی برای نوشتن پرسش شما وجود دارد. </w:t>
+        <w:t xml:space="preserve">پایین چت بات، محلی برای نوشتن پرسش شما وجود دارد. </w:t>
       </w:r>
       <w:r>
         <w:rPr>
@@ -1325,29 +927,7 @@
           <w:rtl/>
           <w:lang w:bidi="fa-IR"/>
         </w:rPr>
-        <w:t xml:space="preserve">یا </w:t>
-      </w:r>
-      <w:proofErr w:type="spellStart"/>
-      <w:r>
-        <w:rPr>
-          <w:rFonts w:ascii="SG Kara" w:hAnsi="SG Kara" w:cs="SG Kara" w:hint="cs"/>
-          <w:sz w:val="20"/>
-          <w:szCs w:val="20"/>
-          <w:rtl/>
-          <w:lang w:bidi="fa-IR"/>
-        </w:rPr>
-        <w:t>مثلت</w:t>
-      </w:r>
-      <w:proofErr w:type="spellEnd"/>
-      <w:r>
-        <w:rPr>
-          <w:rFonts w:ascii="SG Kara" w:hAnsi="SG Kara" w:cs="SG Kara" w:hint="cs"/>
-          <w:sz w:val="20"/>
-          <w:szCs w:val="20"/>
-          <w:rtl/>
-          <w:lang w:bidi="fa-IR"/>
-        </w:rPr>
-        <w:t xml:space="preserve"> آبی رنگ </w:t>
+        <w:t xml:space="preserve">یا مثلت آبی رنگ </w:t>
       </w:r>
       <w:r>
         <w:rPr>
@@ -1610,29 +1190,7 @@
           <w:rtl/>
           <w:lang w:bidi="fa-IR"/>
         </w:rPr>
-        <w:t xml:space="preserve">استفاده ای کند، امکان کپی این متن وجود دارد. برای این کار، لازم است بر روی </w:t>
-      </w:r>
-      <w:proofErr w:type="spellStart"/>
-      <w:r>
-        <w:rPr>
-          <w:rFonts w:ascii="SG Kara" w:hAnsi="SG Kara" w:cs="SG Kara" w:hint="cs"/>
-          <w:sz w:val="20"/>
-          <w:szCs w:val="20"/>
-          <w:rtl/>
-          <w:lang w:bidi="fa-IR"/>
-        </w:rPr>
-        <w:t>آیکون</w:t>
-      </w:r>
-      <w:proofErr w:type="spellEnd"/>
-      <w:r>
-        <w:rPr>
-          <w:rFonts w:ascii="SG Kara" w:hAnsi="SG Kara" w:cs="SG Kara" w:hint="cs"/>
-          <w:sz w:val="20"/>
-          <w:szCs w:val="20"/>
-          <w:rtl/>
-          <w:lang w:bidi="fa-IR"/>
-        </w:rPr>
-        <w:t xml:space="preserve"> "کپی" زده شود. پس از آن متن کپی شده آماده است. </w:t>
+        <w:t xml:space="preserve">استفاده ای کند، امکان کپی این متن وجود دارد. برای این کار، لازم است بر روی آیکون "کپی" زده شود. پس از آن متن کپی شده آماده است. </w:t>
       </w:r>
     </w:p>
     <w:p>
@@ -1660,105 +1218,17 @@
           <w:rtl/>
           <w:lang w:bidi="fa-IR"/>
         </w:rPr>
-        <w:t xml:space="preserve">بستن چت </w:t>
-      </w:r>
-      <w:proofErr w:type="spellStart"/>
-      <w:r>
-        <w:rPr>
-          <w:rFonts w:ascii="SG Kara" w:hAnsi="SG Kara" w:cs="SG Kara" w:hint="cs"/>
-          <w:sz w:val="20"/>
-          <w:szCs w:val="20"/>
-          <w:rtl/>
-          <w:lang w:bidi="fa-IR"/>
-        </w:rPr>
-        <w:t>بات</w:t>
-      </w:r>
-      <w:proofErr w:type="spellEnd"/>
-      <w:r>
-        <w:rPr>
-          <w:rFonts w:ascii="SG Kara" w:hAnsi="SG Kara" w:cs="SG Kara" w:hint="cs"/>
-          <w:sz w:val="20"/>
-          <w:szCs w:val="20"/>
-          <w:rtl/>
-          <w:lang w:bidi="fa-IR"/>
-        </w:rPr>
-        <w:t>:</w:t>
-      </w:r>
-      <w:r>
-        <w:rPr>
-          <w:rFonts w:ascii="SG Kara" w:hAnsi="SG Kara" w:cs="SG Kara" w:hint="cs"/>
-          <w:sz w:val="20"/>
-          <w:szCs w:val="20"/>
-          <w:rtl/>
-          <w:lang w:bidi="fa-IR"/>
-        </w:rPr>
-        <w:t xml:space="preserve"> برای خاتمه دادن به گفتگو با چت </w:t>
-      </w:r>
-      <w:proofErr w:type="spellStart"/>
-      <w:r>
-        <w:rPr>
-          <w:rFonts w:ascii="SG Kara" w:hAnsi="SG Kara" w:cs="SG Kara" w:hint="cs"/>
-          <w:sz w:val="20"/>
-          <w:szCs w:val="20"/>
-          <w:rtl/>
-          <w:lang w:bidi="fa-IR"/>
-        </w:rPr>
-        <w:t>بات</w:t>
-      </w:r>
-      <w:proofErr w:type="spellEnd"/>
-      <w:r>
-        <w:rPr>
-          <w:rFonts w:ascii="SG Kara" w:hAnsi="SG Kara" w:cs="SG Kara" w:hint="cs"/>
-          <w:sz w:val="20"/>
-          <w:szCs w:val="20"/>
-          <w:rtl/>
-          <w:lang w:bidi="fa-IR"/>
-        </w:rPr>
-        <w:t xml:space="preserve">، با فشردن علامت </w:t>
-      </w:r>
-      <w:proofErr w:type="spellStart"/>
-      <w:r>
-        <w:rPr>
-          <w:rFonts w:ascii="SG Kara" w:hAnsi="SG Kara" w:cs="SG Kara" w:hint="cs"/>
-          <w:sz w:val="20"/>
-          <w:szCs w:val="20"/>
-          <w:rtl/>
-          <w:lang w:bidi="fa-IR"/>
-        </w:rPr>
-        <w:t>ضربدر</w:t>
-      </w:r>
-      <w:proofErr w:type="spellEnd"/>
-      <w:r>
-        <w:rPr>
-          <w:rFonts w:ascii="SG Kara" w:hAnsi="SG Kara" w:cs="SG Kara" w:hint="cs"/>
-          <w:sz w:val="20"/>
-          <w:szCs w:val="20"/>
-          <w:rtl/>
-          <w:lang w:bidi="fa-IR"/>
-        </w:rPr>
-        <w:t xml:space="preserve"> در گوشه سمت چپ چت </w:t>
-      </w:r>
-      <w:proofErr w:type="spellStart"/>
-      <w:r>
-        <w:rPr>
-          <w:rFonts w:ascii="SG Kara" w:hAnsi="SG Kara" w:cs="SG Kara" w:hint="cs"/>
-          <w:sz w:val="20"/>
-          <w:szCs w:val="20"/>
-          <w:rtl/>
-          <w:lang w:bidi="fa-IR"/>
-        </w:rPr>
-        <w:t>بات</w:t>
-      </w:r>
-      <w:proofErr w:type="spellEnd"/>
-      <w:r>
-        <w:rPr>
-          <w:rFonts w:ascii="SG Kara" w:hAnsi="SG Kara" w:cs="SG Kara" w:hint="cs"/>
-          <w:sz w:val="20"/>
-          <w:szCs w:val="20"/>
-          <w:rtl/>
-          <w:lang w:bidi="fa-IR"/>
-        </w:rPr>
-        <w:t xml:space="preserve">، میتوان آن را بست. </w:t>
+        <w:t>بستن چت بات:</w:t>
+      </w:r>
+      <w:r>
+        <w:rPr>
+          <w:rFonts w:ascii="SG Kara" w:hAnsi="SG Kara" w:cs="SG Kara" w:hint="cs"/>
+          <w:sz w:val="20"/>
+          <w:szCs w:val="20"/>
+          <w:rtl/>
+          <w:lang w:bidi="fa-IR"/>
+        </w:rPr>
+        <w:t xml:space="preserve"> برای خاتمه دادن به گفتگو با چت بات، با فشردن علامت ضربدر در گوشه سمت چپ چت بات، میتوان آن را بست. </w:t>
       </w:r>
     </w:p>
     <w:p>
@@ -2269,6 +1739,7 @@
     <w:lsdException w:name="HTML Sample" w:semiHidden="1" w:unhideWhenUsed="1"/>
     <w:lsdException w:name="HTML Typewriter" w:semiHidden="1" w:unhideWhenUsed="1"/>
     <w:lsdException w:name="HTML Variable" w:semiHidden="1" w:unhideWhenUsed="1"/>
+    <w:lsdException w:name="Normal Table" w:semiHidden="1" w:unhideWhenUsed="1"/>
     <w:lsdException w:name="annotation subject" w:semiHidden="1" w:unhideWhenUsed="1"/>
     <w:lsdException w:name="No List" w:semiHidden="1" w:unhideWhenUsed="1"/>
     <w:lsdException w:name="Outline List 1" w:semiHidden="1" w:unhideWhenUsed="1"/>
@@ -2315,8 +1786,10 @@
     <w:lsdException w:name="Table Subtle 2" w:semiHidden="1" w:unhideWhenUsed="1"/>
     <w:lsdException w:name="Table Web 1" w:semiHidden="1" w:unhideWhenUsed="1"/>
     <w:lsdException w:name="Table Web 2" w:semiHidden="1" w:unhideWhenUsed="1"/>
+    <w:lsdException w:name="Table Web 3" w:semiHidden="1" w:unhideWhenUsed="1"/>
     <w:lsdException w:name="Balloon Text" w:semiHidden="1" w:unhideWhenUsed="1"/>
     <w:lsdException w:name="Table Grid" w:uiPriority="39"/>
+    <w:lsdException w:name="Table Theme" w:semiHidden="1" w:unhideWhenUsed="1"/>
     <w:lsdException w:name="Placeholder Text" w:semiHidden="1"/>
     <w:lsdException w:name="No Spacing" w:uiPriority="1" w:qFormat="1"/>
     <w:lsdException w:name="Light Shading" w:uiPriority="60"/>

</xml_diff>